<commit_message>
feat(research,render): technical notes stay verbatim in every output, export, library and review page (plan #231 steps b4-b6) (#231)
Co-Authored-By: Claude Opus 5.5 <noreply@anthropic.com>
Claude-Session: https://claude.ai/code/session_01MPRoCfbJuTDz6tit2f4eFM
</commit_message>
<xml_diff>
--- a/brand/brief.docx
+++ b/brand/brief.docx
@@ -120,7 +120,27 @@
     </w:p>
     <w:p>
       <w:r>
+        <w:t>{%p if q.mono %}</w:t>
+      </w:r>
+    </w:p>
+    <w:p>
+      <w:r>
+        <w:t>{{r q.rich }}</w:t>
+      </w:r>
+    </w:p>
+    <w:p>
+      <w:r>
+        <w:t>{%p else %}</w:t>
+      </w:r>
+    </w:p>
+    <w:p>
+      <w:r>
         <w:t>“{{ q.quote }}” [{{ q.n }}]</w:t>
+      </w:r>
+    </w:p>
+    <w:p>
+      <w:r>
+        <w:t>{%p endif %}</w:t>
       </w:r>
     </w:p>
     <w:p>

</xml_diff>

<commit_message>
feat(research): picker without quotes, no duplicate attach, reviewer sees the credit; image links in briefs and the library (plan #231 phase c c4 fixes, c5, c6) (#231)
Co-Authored-By: Claude Opus 5.5 <noreply@anthropic.com>
Claude-Session: https://claude.ai/code/session_01MPRoCfbJuTDz6tit2f4eFM
</commit_message>
<xml_diff>
--- a/brand/brief.docx
+++ b/brand/brief.docx
@@ -103,6 +103,44 @@
     <w:p>
       <w:r>
         <w:t>{%p endfor %}</w:t>
+      </w:r>
+    </w:p>
+    <w:p>
+      <w:r>
+        <w:t>{%p if brief.images %}</w:t>
+      </w:r>
+    </w:p>
+    <w:p>
+      <w:pPr>
+        <w:pStyle w:val="Heading2"/>
+      </w:pPr>
+      <w:r>
+        <w:t>Images on the cited pages</w:t>
+      </w:r>
+    </w:p>
+    <w:p>
+      <w:r>
+        <w:t>Links only; each image is the copyright of its owner.</w:t>
+      </w:r>
+    </w:p>
+    <w:p>
+      <w:r>
+        <w:t>{%p for i in brief.images %}</w:t>
+      </w:r>
+    </w:p>
+    <w:p>
+      <w:r>
+        <w:t>{{ i.title }}, {{ i.publisher }}, {{ i.url }}</w:t>
+      </w:r>
+    </w:p>
+    <w:p>
+      <w:r>
+        <w:t>{%p endfor %}</w:t>
+      </w:r>
+    </w:p>
+    <w:p>
+      <w:r>
+        <w:t>{%p endif %}</w:t>
       </w:r>
     </w:p>
     <w:p>

</xml_diff>

<commit_message>
feat(brief): diagram and credit in brief docx, PDF and Markdown, kept by the library, offered to a case only through Use (plan #231 phase d revised step d4) (#231)
Co-Authored-By: Claude Opus 5.5 <noreply@anthropic.com>
Claude-Session: https://claude.ai/code/session_01MPRoCfbJuTDz6tit2f4eFM
</commit_message>
<xml_diff>
--- a/brand/brief.docx
+++ b/brand/brief.docx
@@ -75,6 +75,37 @@
     <w:p>
       <w:r>
         <w:t>{%p endfor %}</w:t>
+      </w:r>
+    </w:p>
+    <w:p>
+      <w:r>
+        <w:t>{%p if brief.diagram %}</w:t>
+      </w:r>
+    </w:p>
+    <w:p>
+      <w:pPr>
+        <w:pStyle w:val="Heading2"/>
+      </w:pPr>
+      <w:r>
+        <w:t>Diagram</w:t>
+      </w:r>
+    </w:p>
+    <w:p>
+      <w:r>
+        <w:t>{{ brief.diagram }}</w:t>
+      </w:r>
+    </w:p>
+    <w:p>
+      <w:r>
+        <w:rPr>
+          <w:i/>
+        </w:rPr>
+        <w:t>{{ brief.credit }}</w:t>
+      </w:r>
+    </w:p>
+    <w:p>
+      <w:r>
+        <w:t>{%p endif %}</w:t>
       </w:r>
     </w:p>
     <w:p>

</xml_diff>